<commit_message>
3de versie one pager (wil het niet korter dan dit maken), korte reflectie en de readme die gevraagd werd over het verschil tussen het project NU en vorige examenkans.
</commit_message>
<xml_diff>
--- a/One Pager.docx
+++ b/One Pager.docx
@@ -36,7 +36,8 @@
         <w:rPr>
           <w:sz w:val="18"/>
           <w:szCs w:val="18"/>
-          <w:lang w:val="nl-BE" w:bidi="nl-BE"/>
+          <w:highlight w:val="none"/>
+          <w:lang w:val="nl-BE"/>
         </w:rPr>
       </w:r>
       <w:r>
@@ -100,7 +101,8 @@
         <w:rPr>
           <w:sz w:val="22"/>
           <w:szCs w:val="22"/>
-          <w:lang w:val="nl-BE" w:bidi="nl-BE"/>
+          <w:highlight w:val="none"/>
+          <w:lang w:val="nl-BE"/>
         </w:rPr>
       </w:r>
       <w:r>
@@ -136,8 +138,7 @@
         <w:rPr>
           <w:sz w:val="18"/>
           <w:szCs w:val="18"/>
-          <w:highlight w:val="none"/>
-          <w:lang w:val="nl-BE" w:bidi="nl-BE"/>
+          <w:lang w:val="nl-BE"/>
         </w:rPr>
       </w:r>
       <w:r>
@@ -199,7 +200,8 @@
         <w:rPr>
           <w:sz w:val="18"/>
           <w:szCs w:val="18"/>
-          <w:lang w:val="nl-BE" w:bidi="nl-BE"/>
+          <w:highlight w:val="none"/>
+          <w:lang w:val="nl-BE"/>
         </w:rPr>
       </w:r>
       <w:r>
@@ -234,7 +236,7 @@
         <w:rPr>
           <w:sz w:val="18"/>
           <w:szCs w:val="18"/>
-          <w:lang w:val="nl-BE" w:bidi="nl-BE"/>
+          <w:lang w:val="nl-BE"/>
         </w:rPr>
       </w:r>
       <w:r>
@@ -273,6 +275,13 @@
           <w:lang w:val="nl-BE"/>
         </w:rPr>
       </w:r>
+      <w:r>
+        <w:rPr>
+          <w:sz w:val="24"/>
+          <w:szCs w:val="24"/>
+          <w:lang w:val="nl-BE"/>
+        </w:rPr>
+      </w:r>
     </w:p>
     <w:p>
       <w:pPr>
@@ -293,6 +302,13 @@
           <w:lang w:val="nl-BE"/>
         </w:rPr>
         <w:t xml:space="preserve">Keep Dishes Going is opgebouwd uit drie microservices: restaurant-service, order-service en delivery-service. Onderling praten ze via HTTP voor queries en validaties, en via RabbitMQ voor de order-levenscyclus: van OrderPlaced tot OrderDelivered.</w:t>
+      </w:r>
+      <w:r>
+        <w:rPr>
+          <w:sz w:val="18"/>
+          <w:szCs w:val="18"/>
+          <w:lang w:val="nl-BE"/>
+        </w:rPr>
       </w:r>
       <w:r>
         <w:rPr>
@@ -393,6 +409,13 @@
           <w:lang w:val="nl-BE"/>
         </w:rPr>
       </w:r>
+      <w:r>
+        <w:rPr>
+          <w:sz w:val="18"/>
+          <w:szCs w:val="18"/>
+          <w:lang w:val="nl-BE"/>
+        </w:rPr>
+      </w:r>
     </w:p>
     <w:p>
       <w:pPr>
@@ -411,6 +434,13 @@
           <w:sz w:val="18"/>
           <w:szCs w:val="18"/>
           <w:lang w:val="nl-BE" w:bidi="nl-BE"/>
+        </w:rPr>
+      </w:r>
+      <w:r>
+        <w:rPr>
+          <w:sz w:val="18"/>
+          <w:szCs w:val="18"/>
+          <w:lang w:val="nl-BE"/>
         </w:rPr>
       </w:r>
       <w:r>
@@ -449,6 +479,13 @@
           <w:lang w:val="nl-BE"/>
         </w:rPr>
       </w:r>
+      <w:r>
+        <w:rPr>
+          <w:sz w:val="24"/>
+          <w:szCs w:val="24"/>
+          <w:lang w:val="nl-BE"/>
+        </w:rPr>
+      </w:r>
     </w:p>
     <w:p>
       <w:pPr>
@@ -478,6 +515,13 @@
           <w:lang w:val="nl-BE"/>
         </w:rPr>
       </w:r>
+      <w:r>
+        <w:rPr>
+          <w:sz w:val="22"/>
+          <w:szCs w:val="22"/>
+          <w:lang w:val="nl-BE"/>
+        </w:rPr>
+      </w:r>
     </w:p>
     <w:p>
       <w:pPr>
@@ -506,6 +550,13 @@
           <w:lang w:val="nl-BE"/>
         </w:rPr>
       </w:r>
+      <w:r>
+        <w:rPr>
+          <w:sz w:val="18"/>
+          <w:szCs w:val="18"/>
+          <w:lang w:val="nl-BE"/>
+        </w:rPr>
+      </w:r>
     </w:p>
     <w:p>
       <w:pPr>
@@ -527,6 +578,13 @@
           <w:lang w:val="nl-BE"/>
         </w:rPr>
         <w:t xml:space="preserve">Concrete toepassingen in KDG:</w:t>
+      </w:r>
+      <w:r>
+        <w:rPr>
+          <w:sz w:val="18"/>
+          <w:szCs w:val="18"/>
+          <w:lang w:val="nl-BE"/>
+        </w:rPr>
       </w:r>
       <w:r>
         <w:rPr>
@@ -572,6 +630,13 @@
           <w:lang w:val="nl-BE"/>
         </w:rPr>
       </w:r>
+      <w:r>
+        <w:rPr>
+          <w:sz w:val="18"/>
+          <w:szCs w:val="18"/>
+          <w:lang w:val="nl-BE"/>
+        </w:rPr>
+      </w:r>
     </w:p>
     <w:p>
       <w:pPr>
@@ -593,6 +658,13 @@
           <w:lang w:val="nl-BE"/>
         </w:rPr>
         <w:t xml:space="preserve">- Order-service: na Order.place() publiceert de order een OrderPlacedDomainEvent; tracking, analytics of een welkomstmail volgen als losse listeners.</w:t>
+      </w:r>
+      <w:r>
+        <w:rPr>
+          <w:sz w:val="18"/>
+          <w:szCs w:val="18"/>
+          <w:lang w:val="nl-BE"/>
+        </w:rPr>
       </w:r>
       <w:r>
         <w:rPr>
@@ -644,7 +716,7 @@
         <w:rPr>
           <w:sz w:val="18"/>
           <w:szCs w:val="18"/>
-          <w:lang w:val="nl-BE" w:bidi="nl-BE"/>
+          <w:lang w:val="nl-BE"/>
         </w:rPr>
       </w:r>
       <w:r>
@@ -675,6 +747,13 @@
           <w:lang w:val="nl-BE"/>
         </w:rPr>
         <w:t xml:space="preserve">Cross-cutting concerns scheiden</w:t>
+      </w:r>
+      <w:r>
+        <w:rPr>
+          <w:sz w:val="22"/>
+          <w:szCs w:val="22"/>
+          <w:lang w:val="nl-BE"/>
+        </w:rPr>
       </w:r>
       <w:r>
         <w:rPr>
@@ -764,7 +843,7 @@
         <w:rPr>
           <w:sz w:val="18"/>
           <w:szCs w:val="18"/>
-          <w:lang w:val="nl-BE" w:bidi="nl-BE"/>
+          <w:lang w:val="nl-BE"/>
         </w:rPr>
       </w:r>
       <w:r>
@@ -795,6 +874,13 @@
           <w:lang w:val="nl-BE"/>
         </w:rPr>
         <w:t xml:space="preserve">Domein-events als eerste-klas burgers</w:t>
+      </w:r>
+      <w:r>
+        <w:rPr>
+          <w:sz w:val="22"/>
+          <w:szCs w:val="22"/>
+          <w:lang w:val="nl-BE"/>
+        </w:rPr>
       </w:r>
       <w:r>
         <w:rPr>
@@ -863,6 +949,13 @@
           <w:lang w:val="nl-BE"/>
         </w:rPr>
       </w:r>
+      <w:r>
+        <w:rPr>
+          <w:sz w:val="18"/>
+          <w:szCs w:val="18"/>
+          <w:lang w:val="nl-BE"/>
+        </w:rPr>
+      </w:r>
     </w:p>
     <w:p>
       <w:pPr>
@@ -883,6 +976,13 @@
           <w:lang w:val="nl-BE"/>
         </w:rPr>
         <w:t xml:space="preserve">- Zo kent de service geen RabbitTemplate, routing keys of exchange-namen meer; AMQP wordt een implementatiedetail.</w:t>
+      </w:r>
+      <w:r>
+        <w:rPr>
+          <w:sz w:val="18"/>
+          <w:szCs w:val="18"/>
+          <w:lang w:val="nl-BE"/>
+        </w:rPr>
       </w:r>
       <w:r>
         <w:rPr>
@@ -942,7 +1042,13 @@
           <w:lang w:val="nl-BE"/>
         </w:rPr>
       </w:r>
-      <w:r/>
+      <w:r>
+        <w:rPr>
+          <w:sz w:val="18"/>
+          <w:szCs w:val="18"/>
+          <w:lang w:val="nl-BE"/>
+        </w:rPr>
+      </w:r>
     </w:p>
     <w:p>
       <w:pPr>
@@ -970,6 +1076,13 @@
           <w:lang w:val="nl-BE"/>
         </w:rPr>
       </w:r>
+      <w:r>
+        <w:rPr>
+          <w:sz w:val="18"/>
+          <w:szCs w:val="18"/>
+          <w:lang w:val="nl-BE"/>
+        </w:rPr>
+      </w:r>
     </w:p>
     <w:p>
       <w:pPr>
@@ -991,6 +1104,13 @@
           <w:lang w:val="nl-BE"/>
         </w:rPr>
         <w:t xml:space="preserve">Voordelen</w:t>
+      </w:r>
+      <w:r>
+        <w:rPr>
+          <w:sz w:val="24"/>
+          <w:szCs w:val="24"/>
+          <w:lang w:val="nl-BE"/>
+        </w:rPr>
       </w:r>
       <w:r>
         <w:rPr>
@@ -1029,6 +1149,7 @@
           <w:szCs w:val="18"/>
           <w:lang w:val="nl-BE"/>
         </w:rPr>
+        <w:tab/>
         <w:t xml:space="preserve">s</w:t>
       </w:r>
       <w:r>
@@ -1046,6 +1167,13 @@
           <w:lang w:val="nl-BE"/>
         </w:rPr>
       </w:r>
+      <w:r>
+        <w:rPr>
+          <w:sz w:val="18"/>
+          <w:szCs w:val="18"/>
+          <w:lang w:val="nl-BE"/>
+        </w:rPr>
+      </w:r>
     </w:p>
     <w:p>
       <w:pPr>
@@ -1065,7 +1193,16 @@
           <w:szCs w:val="18"/>
           <w:lang w:val="nl-BE"/>
         </w:rPr>
-        <w:t xml:space="preserve">Eén aggregate per transactie : respecteert de DDD-consistentiegrens.</w:t>
+        <w:t xml:space="preserve">Eén aggregate per transactie : </w:t>
+        <w:tab/>
+        <w:t xml:space="preserve">respecteert de DDD-consistentiegrens.</w:t>
+      </w:r>
+      <w:r>
+        <w:rPr>
+          <w:sz w:val="18"/>
+          <w:szCs w:val="18"/>
+          <w:lang w:val="nl-BE"/>
+        </w:rPr>
       </w:r>
       <w:r>
         <w:rPr>
@@ -1094,6 +1231,7 @@
           <w:lang w:val="nl-BE"/>
         </w:rPr>
         <w:t xml:space="preserve">Uitbreidbaar : </w:t>
+        <w:tab/>
         <w:tab/>
         <w:tab/>
         <w:t xml:space="preserve">nieuwe listener = nieuwe feature, zonder bestaande code aan te raken.</w:t>
@@ -1105,6 +1243,13 @@
           <w:lang w:val="nl-BE"/>
         </w:rPr>
       </w:r>
+      <w:r>
+        <w:rPr>
+          <w:sz w:val="18"/>
+          <w:szCs w:val="18"/>
+          <w:lang w:val="nl-BE"/>
+        </w:rPr>
+      </w:r>
     </w:p>
     <w:p>
       <w:pPr>
@@ -1127,7 +1272,15 @@
         <w:t xml:space="preserve">Testbaar : </w:t>
         <w:tab/>
         <w:tab/>
+        <w:tab/>
         <w:t xml:space="preserve">domeinlogica en listeners los testen, zonder infrastructuur.</w:t>
+      </w:r>
+      <w:r>
+        <w:rPr>
+          <w:sz w:val="18"/>
+          <w:szCs w:val="18"/>
+          <w:lang w:val="nl-BE"/>
+        </w:rPr>
       </w:r>
       <w:r>
         <w:rPr>
@@ -1163,6 +1316,13 @@
           <w:lang w:val="nl-BE"/>
         </w:rPr>
       </w:r>
+      <w:r>
+        <w:rPr>
+          <w:sz w:val="18"/>
+          <w:szCs w:val="18"/>
+          <w:lang w:val="nl-BE"/>
+        </w:rPr>
+      </w:r>
     </w:p>
     <w:p>
       <w:pPr>
@@ -1184,6 +1344,13 @@
           <w:lang w:val="nl-BE"/>
         </w:rPr>
         <w:t xml:space="preserve">Nadelen &amp; risico's</w:t>
+      </w:r>
+      <w:r>
+        <w:rPr>
+          <w:sz w:val="24"/>
+          <w:szCs w:val="24"/>
+          <w:lang w:val="nl-BE"/>
+        </w:rPr>
       </w:r>
       <w:r>
         <w:rPr>
@@ -1223,6 +1390,13 @@
           <w:lang w:val="nl-BE"/>
         </w:rPr>
       </w:r>
+      <w:r>
+        <w:rPr>
+          <w:sz w:val="18"/>
+          <w:szCs w:val="18"/>
+          <w:lang w:val="nl-BE"/>
+        </w:rPr>
+      </w:r>
     </w:p>
     <w:p>
       <w:pPr>
@@ -1254,6 +1428,13 @@
           <w:lang w:val="nl-BE"/>
         </w:rPr>
       </w:r>
+      <w:r>
+        <w:rPr>
+          <w:sz w:val="18"/>
+          <w:szCs w:val="18"/>
+          <w:lang w:val="nl-BE"/>
+        </w:rPr>
+      </w:r>
     </w:p>
     <w:p>
       <w:pPr>
@@ -1277,6 +1458,13 @@
         <w:tab/>
         <w:tab/>
         <w:t xml:space="preserve">de stack trace stopt bij de publisher; gebruik correlation IDs (traceId).</w:t>
+      </w:r>
+      <w:r>
+        <w:rPr>
+          <w:sz w:val="18"/>
+          <w:szCs w:val="18"/>
+          <w:lang w:val="nl-BE"/>
+        </w:rPr>
       </w:r>
       <w:r>
         <w:rPr>
@@ -1385,6 +1573,13 @@
           <w:lang w:val="nl-BE"/>
         </w:rPr>
       </w:r>
+      <w:r>
+        <w:rPr>
+          <w:sz w:val="18"/>
+          <w:szCs w:val="18"/>
+          <w:lang w:val="nl-BE"/>
+        </w:rPr>
+      </w:r>
     </w:p>
     <w:p>
       <w:pPr>
@@ -1412,6 +1607,13 @@
           <w:lang w:val="nl-BE"/>
         </w:rPr>
       </w:r>
+      <w:r>
+        <w:rPr>
+          <w:sz w:val="18"/>
+          <w:szCs w:val="18"/>
+          <w:lang w:val="nl-BE"/>
+        </w:rPr>
+      </w:r>
     </w:p>
     <w:p>
       <w:pPr>
@@ -1433,6 +1635,13 @@
           <w:lang w:val="nl-BE"/>
         </w:rPr>
         <w:t xml:space="preserve">Conclusie</w:t>
+      </w:r>
+      <w:r>
+        <w:rPr>
+          <w:sz w:val="24"/>
+          <w:szCs w:val="24"/>
+          <w:lang w:val="nl-BE"/>
+        </w:rPr>
       </w:r>
       <w:r>
         <w:rPr>
@@ -1477,6 +1686,13 @@
           <w:lang w:val="nl-BE"/>
         </w:rPr>
       </w:r>
+      <w:r>
+        <w:rPr>
+          <w:sz w:val="18"/>
+          <w:szCs w:val="18"/>
+          <w:lang w:val="nl-BE"/>
+        </w:rPr>
+      </w:r>
     </w:p>
     <w:p>
       <w:pPr>
@@ -1514,6 +1730,13 @@
           <w:lang w:val="nl-BE"/>
         </w:rPr>
       </w:r>
+      <w:r>
+        <w:rPr>
+          <w:sz w:val="18"/>
+          <w:szCs w:val="18"/>
+          <w:lang w:val="nl-BE"/>
+        </w:rPr>
+      </w:r>
     </w:p>
     <w:p>
       <w:pPr>
@@ -1551,6 +1774,13 @@
           <w:lang w:val="nl-BE"/>
         </w:rPr>
       </w:r>
+      <w:r>
+        <w:rPr>
+          <w:sz w:val="18"/>
+          <w:szCs w:val="18"/>
+          <w:lang w:val="nl-BE"/>
+        </w:rPr>
+      </w:r>
     </w:p>
     <w:p>
       <w:pPr>
@@ -1588,6 +1818,13 @@
           <w:lang w:val="nl-BE"/>
         </w:rPr>
       </w:r>
+      <w:r>
+        <w:rPr>
+          <w:sz w:val="18"/>
+          <w:szCs w:val="18"/>
+          <w:lang w:val="nl-BE"/>
+        </w:rPr>
+      </w:r>
     </w:p>
     <w:p>
       <w:pPr>
@@ -1616,6 +1853,13 @@
           <w:lang w:val="en-US"/>
         </w:rPr>
         <w:t xml:space="preserve">.</w:t>
+      </w:r>
+      <w:r>
+        <w:rPr>
+          <w:sz w:val="18"/>
+          <w:szCs w:val="18"/>
+          <w:lang w:val="nl-BE"/>
+        </w:rPr>
       </w:r>
       <w:r>
         <w:rPr>

</xml_diff>